<commit_message>
docs: adicionado arquivos de template de visão de dados
</commit_message>
<xml_diff>
--- a/Docs/Modelagem de projeto/Visão de Dados/Script SQL DDL Vrs 1.0.docx
+++ b/Docs/Modelagem de projeto/Visão de Dados/Script SQL DDL Vrs 1.0.docx
@@ -1,6 +1,6 @@
 
 <file path=word/document.xml><?xml version="1.0" encoding="utf-8"?>
-<w:document xmlns:wpc="http://schemas.microsoft.com/office/word/2010/wordprocessingCanvas" xmlns:cx="http://schemas.microsoft.com/office/drawing/2014/chartex" xmlns:cx1="http://schemas.microsoft.com/office/drawing/2015/9/8/chartex" xmlns:cx2="http://schemas.microsoft.com/office/drawing/2015/10/21/chartex" xmlns:cx3="http://schemas.microsoft.com/office/drawing/2016/5/9/chartex" xmlns:cx4="http://schemas.microsoft.com/office/drawing/2016/5/10/chartex" xmlns:cx5="http://schemas.microsoft.com/office/drawing/2016/5/11/chartex" xmlns:cx6="http://schemas.microsoft.com/office/drawing/2016/5/12/chartex" xmlns:cx7="http://schemas.microsoft.com/office/drawing/2016/5/13/chartex" xmlns:cx8="http://schemas.microsoft.com/office/drawing/2016/5/14/chartex" xmlns:mc="http://schemas.openxmlformats.org/markup-compatibility/2006" xmlns:aink="http://schemas.microsoft.com/office/drawing/2016/ink" xmlns:am3d="http://schemas.microsoft.com/office/drawing/2017/model3d" xmlns:o="urn:schemas-microsoft-com:office:office" xmlns:r="http://schemas.openxmlformats.org/officeDocument/2006/relationships" xmlns:m="http://schemas.openxmlformats.org/officeDocument/2006/math" xmlns:v="urn:schemas-microsoft-com:vml" xmlns:wp14="http://schemas.microsoft.com/office/word/2010/wordprocessingDrawing" xmlns:wp="http://schemas.openxmlformats.org/drawingml/2006/wordprocessingDrawing" xmlns:w10="urn:schemas-microsoft-com:office:word" xmlns:w="http://schemas.openxmlformats.org/wordprocessingml/2006/main" xmlns:w14="http://schemas.microsoft.com/office/word/2010/wordml" xmlns:w15="http://schemas.microsoft.com/office/word/2012/wordml" xmlns:w16cex="http://schemas.microsoft.com/office/word/2018/wordml/cex" xmlns:w16cid="http://schemas.microsoft.com/office/word/2016/wordml/cid" xmlns:w16="http://schemas.microsoft.com/office/word/2018/wordml" xmlns:w16sdtdh="http://schemas.microsoft.com/office/word/2020/wordml/sdtdatahash" xmlns:w16se="http://schemas.microsoft.com/office/word/2015/wordml/symex" xmlns:wpg="http://schemas.microsoft.com/office/word/2010/wordprocessingGroup" xmlns:wpi="http://schemas.microsoft.com/office/word/2010/wordprocessingInk" xmlns:wne="http://schemas.microsoft.com/office/word/2006/wordml" xmlns:wps="http://schemas.microsoft.com/office/word/2010/wordprocessingShape" mc:Ignorable="w14 w15 w16se w16cid w16 w16cex w16sdtdh wp14">
+<w:document xmlns:wpc="http://schemas.microsoft.com/office/word/2010/wordprocessingCanvas" xmlns:cx="http://schemas.microsoft.com/office/drawing/2014/chartex" xmlns:cx1="http://schemas.microsoft.com/office/drawing/2015/9/8/chartex" xmlns:cx2="http://schemas.microsoft.com/office/drawing/2015/10/21/chartex" xmlns:cx3="http://schemas.microsoft.com/office/drawing/2016/5/9/chartex" xmlns:cx4="http://schemas.microsoft.com/office/drawing/2016/5/10/chartex" xmlns:cx5="http://schemas.microsoft.com/office/drawing/2016/5/11/chartex" xmlns:cx6="http://schemas.microsoft.com/office/drawing/2016/5/12/chartex" xmlns:cx7="http://schemas.microsoft.com/office/drawing/2016/5/13/chartex" xmlns:cx8="http://schemas.microsoft.com/office/drawing/2016/5/14/chartex" xmlns:mc="http://schemas.openxmlformats.org/markup-compatibility/2006" xmlns:aink="http://schemas.microsoft.com/office/drawing/2016/ink" xmlns:am3d="http://schemas.microsoft.com/office/drawing/2017/model3d" xmlns:o="urn:schemas-microsoft-com:office:office" xmlns:oel="http://schemas.microsoft.com/office/2019/extlst" xmlns:r="http://schemas.openxmlformats.org/officeDocument/2006/relationships" xmlns:m="http://schemas.openxmlformats.org/officeDocument/2006/math" xmlns:v="urn:schemas-microsoft-com:vml" xmlns:wp14="http://schemas.microsoft.com/office/word/2010/wordprocessingDrawing" xmlns:wp="http://schemas.openxmlformats.org/drawingml/2006/wordprocessingDrawing" xmlns:w10="urn:schemas-microsoft-com:office:word" xmlns:w="http://schemas.openxmlformats.org/wordprocessingml/2006/main" xmlns:w14="http://schemas.microsoft.com/office/word/2010/wordml" xmlns:w15="http://schemas.microsoft.com/office/word/2012/wordml" xmlns:w16cex="http://schemas.microsoft.com/office/word/2018/wordml/cex" xmlns:w16cid="http://schemas.microsoft.com/office/word/2016/wordml/cid" xmlns:w16="http://schemas.microsoft.com/office/word/2018/wordml" xmlns:w16sdtdh="http://schemas.microsoft.com/office/word/2020/wordml/sdtdatahash" xmlns:w16se="http://schemas.microsoft.com/office/word/2015/wordml/symex" xmlns:wpg="http://schemas.microsoft.com/office/word/2010/wordprocessingGroup" xmlns:wpi="http://schemas.microsoft.com/office/word/2010/wordprocessingInk" xmlns:wne="http://schemas.microsoft.com/office/word/2006/wordml" xmlns:wps="http://schemas.microsoft.com/office/word/2010/wordprocessingShape" mc:Ignorable="w14 w15 w16se w16cid w16 w16cex w16sdtdh wp14">
   <w:body>
     <w:p>
       <w:pPr>
@@ -88,7 +88,615 @@
     <w:p/>
     <w:p>
       <w:r>
+        <w:t xml:space="preserve">DROP DATABASE IF </w:t>
+      </w:r>
+      <w:proofErr w:type="spellStart"/>
+      <w:r>
+        <w:t>exists</w:t>
+      </w:r>
+      <w:proofErr w:type="spellEnd"/>
+      <w:r>
+        <w:t xml:space="preserve"> </w:t>
+      </w:r>
+      <w:proofErr w:type="spellStart"/>
+      <w:r>
+        <w:t>find_collectors</w:t>
+      </w:r>
+      <w:proofErr w:type="spellEnd"/>
+      <w:r>
+        <w:t>;</w:t>
+      </w:r>
+    </w:p>
+    <w:p>
+      <w:r>
+        <w:t xml:space="preserve">CREATE DATABASE </w:t>
+      </w:r>
+      <w:proofErr w:type="spellStart"/>
+      <w:r>
+        <w:t>find_collectors</w:t>
+      </w:r>
+      <w:proofErr w:type="spellEnd"/>
+      <w:r>
+        <w:t>;</w:t>
+      </w:r>
+    </w:p>
+    <w:p>
+      <w:r>
+        <w:t>\c</w:t>
+      </w:r>
+    </w:p>
+    <w:p/>
+    <w:p>
+      <w:r>
         <w:t>BEGIN;</w:t>
+      </w:r>
+    </w:p>
+    <w:p/>
+    <w:p>
+      <w:r>
+        <w:t xml:space="preserve">CREATE TABLE </w:t>
+      </w:r>
+      <w:proofErr w:type="gramStart"/>
+      <w:r>
+        <w:t>pessoa(</w:t>
+      </w:r>
+      <w:proofErr w:type="gramEnd"/>
+    </w:p>
+    <w:p>
+      <w:r>
+        <w:t xml:space="preserve">    id serial PRIMARY KEY,</w:t>
+      </w:r>
+    </w:p>
+    <w:p>
+      <w:r>
+        <w:t xml:space="preserve">    </w:t>
+      </w:r>
+      <w:proofErr w:type="spellStart"/>
+      <w:r>
+        <w:t>email</w:t>
+      </w:r>
+      <w:proofErr w:type="spellEnd"/>
+      <w:r>
+        <w:t xml:space="preserve"> </w:t>
+      </w:r>
+      <w:proofErr w:type="gramStart"/>
+      <w:r>
+        <w:t>VARCHAR(</w:t>
+      </w:r>
+      <w:proofErr w:type="gramEnd"/>
+      <w:r>
+        <w:t>100) NOT NULL UNIQUE,</w:t>
+      </w:r>
+    </w:p>
+    <w:p>
+      <w:r>
+        <w:t xml:space="preserve">    senha </w:t>
+      </w:r>
+      <w:proofErr w:type="gramStart"/>
+      <w:r>
+        <w:t>VARCHAR(</w:t>
+      </w:r>
+      <w:proofErr w:type="gramEnd"/>
+      <w:r>
+        <w:t>100),</w:t>
+      </w:r>
+    </w:p>
+    <w:p>
+      <w:r>
+        <w:t xml:space="preserve">    telefone </w:t>
+      </w:r>
+      <w:proofErr w:type="gramStart"/>
+      <w:r>
+        <w:t>VARCHAR(</w:t>
+      </w:r>
+      <w:proofErr w:type="gramEnd"/>
+      <w:r>
+        <w:t>15),</w:t>
+      </w:r>
+    </w:p>
+    <w:p>
+      <w:r>
+        <w:t xml:space="preserve">    </w:t>
+      </w:r>
+      <w:proofErr w:type="spellStart"/>
+      <w:r>
+        <w:t>endereco</w:t>
+      </w:r>
+      <w:proofErr w:type="spellEnd"/>
+      <w:r>
+        <w:t xml:space="preserve"> </w:t>
+      </w:r>
+      <w:proofErr w:type="gramStart"/>
+      <w:r>
+        <w:t>VARCHAR(</w:t>
+      </w:r>
+      <w:proofErr w:type="gramEnd"/>
+      <w:r>
+        <w:t>100) NOT NULL,</w:t>
+      </w:r>
+    </w:p>
+    <w:p>
+      <w:r>
+        <w:lastRenderedPageBreak/>
+        <w:t xml:space="preserve">    bairro </w:t>
+      </w:r>
+      <w:proofErr w:type="gramStart"/>
+      <w:r>
+        <w:t>VARCHAR(</w:t>
+      </w:r>
+      <w:proofErr w:type="gramEnd"/>
+      <w:r>
+        <w:t>100) NOT NULL,</w:t>
+      </w:r>
+    </w:p>
+    <w:p>
+      <w:r>
+        <w:t xml:space="preserve">    </w:t>
+      </w:r>
+      <w:proofErr w:type="spellStart"/>
+      <w:r>
+        <w:t>numero</w:t>
+      </w:r>
+      <w:proofErr w:type="spellEnd"/>
+      <w:r>
+        <w:t xml:space="preserve"> </w:t>
+      </w:r>
+      <w:proofErr w:type="gramStart"/>
+      <w:r>
+        <w:t>VARCHAR(</w:t>
+      </w:r>
+      <w:proofErr w:type="gramEnd"/>
+      <w:r>
+        <w:t>10) NOT NULL</w:t>
+      </w:r>
+    </w:p>
+    <w:p>
+      <w:r>
+        <w:t>);</w:t>
+      </w:r>
+    </w:p>
+    <w:p/>
+    <w:p>
+      <w:r>
+        <w:t xml:space="preserve">CREATE TABLE </w:t>
+      </w:r>
+      <w:proofErr w:type="gramStart"/>
+      <w:r>
+        <w:t>catador(</w:t>
+      </w:r>
+      <w:proofErr w:type="gramEnd"/>
+    </w:p>
+    <w:p>
+      <w:r>
+        <w:t xml:space="preserve">    id serial PRIMARY KEY,</w:t>
+      </w:r>
+    </w:p>
+    <w:p>
+      <w:r>
+        <w:t xml:space="preserve">    tipo VARCHAR (100),</w:t>
+      </w:r>
+    </w:p>
+    <w:p>
+      <w:r>
+        <w:t xml:space="preserve">    </w:t>
+      </w:r>
+      <w:proofErr w:type="spellStart"/>
+      <w:r>
+        <w:t>descricao</w:t>
+      </w:r>
+      <w:proofErr w:type="spellEnd"/>
+      <w:r>
+        <w:t xml:space="preserve"> </w:t>
+      </w:r>
+      <w:r>
+        <w:t>TEXT</w:t>
+      </w:r>
+    </w:p>
+    <w:p>
+      <w:r>
+        <w:t xml:space="preserve">    </w:t>
+      </w:r>
+      <w:proofErr w:type="spellStart"/>
+      <w:r>
+        <w:t>pessoa_id</w:t>
+      </w:r>
+      <w:proofErr w:type="spellEnd"/>
+      <w:r>
+        <w:t xml:space="preserve"> </w:t>
+      </w:r>
+      <w:proofErr w:type="spellStart"/>
+      <w:r>
+        <w:t>integer</w:t>
+      </w:r>
+      <w:proofErr w:type="spellEnd"/>
+      <w:r>
+        <w:t xml:space="preserve"> </w:t>
+      </w:r>
+      <w:proofErr w:type="spellStart"/>
+      <w:r>
+        <w:t>not</w:t>
+      </w:r>
+      <w:proofErr w:type="spellEnd"/>
+      <w:r>
+        <w:t xml:space="preserve"> </w:t>
+      </w:r>
+      <w:proofErr w:type="spellStart"/>
+      <w:r>
+        <w:t>null</w:t>
+      </w:r>
+      <w:proofErr w:type="spellEnd"/>
+      <w:r>
+        <w:t xml:space="preserve"> </w:t>
+      </w:r>
+      <w:proofErr w:type="spellStart"/>
+      <w:r>
+        <w:t>references</w:t>
+      </w:r>
+      <w:proofErr w:type="spellEnd"/>
+      <w:r>
+        <w:t xml:space="preserve"> pessoa(id) </w:t>
+      </w:r>
+      <w:proofErr w:type="spellStart"/>
+      <w:r>
+        <w:t>on</w:t>
+      </w:r>
+      <w:proofErr w:type="spellEnd"/>
+      <w:r>
+        <w:t xml:space="preserve"> update </w:t>
+      </w:r>
+      <w:proofErr w:type="spellStart"/>
+      <w:r>
+        <w:t>cascade</w:t>
+      </w:r>
+      <w:proofErr w:type="spellEnd"/>
+    </w:p>
+    <w:p>
+      <w:r>
+        <w:t>);</w:t>
+      </w:r>
+    </w:p>
+    <w:p/>
+    <w:p>
+      <w:r>
+        <w:t xml:space="preserve">CREATE TABLE </w:t>
+      </w:r>
+      <w:proofErr w:type="gramStart"/>
+      <w:r>
+        <w:t>reciclador(</w:t>
+      </w:r>
+      <w:proofErr w:type="gramEnd"/>
+    </w:p>
+    <w:p>
+      <w:r>
+        <w:t xml:space="preserve">    id serial PRIMARY KEY,</w:t>
+      </w:r>
+    </w:p>
+    <w:p>
+      <w:r>
+        <w:t xml:space="preserve">    </w:t>
+      </w:r>
+      <w:proofErr w:type="spellStart"/>
+      <w:r>
+        <w:t>Afilhado_id</w:t>
+      </w:r>
+      <w:proofErr w:type="spellEnd"/>
+      <w:r>
+        <w:t xml:space="preserve"> </w:t>
+      </w:r>
+      <w:proofErr w:type="spellStart"/>
+      <w:r>
+        <w:t>integer</w:t>
+      </w:r>
+      <w:proofErr w:type="spellEnd"/>
+      <w:r>
+        <w:t xml:space="preserve"> </w:t>
+      </w:r>
+      <w:proofErr w:type="spellStart"/>
+      <w:r>
+        <w:t>not</w:t>
+      </w:r>
+      <w:proofErr w:type="spellEnd"/>
+      <w:r>
+        <w:t xml:space="preserve"> </w:t>
+      </w:r>
+      <w:proofErr w:type="spellStart"/>
+      <w:r>
+        <w:t>null</w:t>
+      </w:r>
+      <w:proofErr w:type="spellEnd"/>
+      <w:r>
+        <w:t xml:space="preserve"> </w:t>
+      </w:r>
+      <w:proofErr w:type="spellStart"/>
+      <w:r>
+        <w:t>references</w:t>
+      </w:r>
+      <w:proofErr w:type="spellEnd"/>
+      <w:r>
+        <w:t xml:space="preserve"> catador(id) </w:t>
+      </w:r>
+      <w:proofErr w:type="spellStart"/>
+      <w:r>
+        <w:t>on</w:t>
+      </w:r>
+      <w:proofErr w:type="spellEnd"/>
+      <w:r>
+        <w:t xml:space="preserve"> update </w:t>
+      </w:r>
+      <w:proofErr w:type="spellStart"/>
+      <w:r>
+        <w:t>cascade</w:t>
+      </w:r>
+      <w:proofErr w:type="spellEnd"/>
+      <w:r>
+        <w:t>,</w:t>
+      </w:r>
+    </w:p>
+    <w:p>
+      <w:r>
+        <w:t xml:space="preserve">    </w:t>
+      </w:r>
+      <w:proofErr w:type="spellStart"/>
+      <w:r>
+        <w:t>pessoa_id</w:t>
+      </w:r>
+      <w:proofErr w:type="spellEnd"/>
+      <w:r>
+        <w:t xml:space="preserve"> </w:t>
+      </w:r>
+      <w:proofErr w:type="spellStart"/>
+      <w:r>
+        <w:t>integer</w:t>
+      </w:r>
+      <w:proofErr w:type="spellEnd"/>
+      <w:r>
+        <w:t xml:space="preserve"> </w:t>
+      </w:r>
+      <w:proofErr w:type="spellStart"/>
+      <w:r>
+        <w:t>not</w:t>
+      </w:r>
+      <w:proofErr w:type="spellEnd"/>
+      <w:r>
+        <w:t xml:space="preserve"> </w:t>
+      </w:r>
+      <w:proofErr w:type="spellStart"/>
+      <w:r>
+        <w:t>null</w:t>
+      </w:r>
+      <w:proofErr w:type="spellEnd"/>
+      <w:r>
+        <w:t xml:space="preserve"> </w:t>
+      </w:r>
+      <w:proofErr w:type="spellStart"/>
+      <w:r>
+        <w:t>references</w:t>
+      </w:r>
+      <w:proofErr w:type="spellEnd"/>
+      <w:r>
+        <w:t xml:space="preserve"> pessoa(id) </w:t>
+      </w:r>
+      <w:proofErr w:type="spellStart"/>
+      <w:r>
+        <w:t>on</w:t>
+      </w:r>
+      <w:proofErr w:type="spellEnd"/>
+      <w:r>
+        <w:t xml:space="preserve"> update </w:t>
+      </w:r>
+      <w:proofErr w:type="spellStart"/>
+      <w:r>
+        <w:t>cascade</w:t>
+      </w:r>
+      <w:proofErr w:type="spellEnd"/>
+    </w:p>
+    <w:p>
+      <w:r>
+        <w:t>);</w:t>
+      </w:r>
+    </w:p>
+    <w:p/>
+    <w:p>
+      <w:r>
+        <w:t xml:space="preserve">CREATE TABLE </w:t>
+      </w:r>
+      <w:proofErr w:type="gramStart"/>
+      <w:r>
+        <w:t>coleta(</w:t>
+      </w:r>
+      <w:proofErr w:type="gramEnd"/>
+    </w:p>
+    <w:p>
+      <w:r>
+        <w:t xml:space="preserve">    id serial PRIMARY KEY,</w:t>
+      </w:r>
+    </w:p>
+    <w:p>
+      <w:r>
+        <w:t xml:space="preserve">    </w:t>
+      </w:r>
+      <w:proofErr w:type="spellStart"/>
+      <w:r>
+        <w:t>data_e_hora</w:t>
+      </w:r>
+      <w:proofErr w:type="spellEnd"/>
+      <w:r>
+        <w:t xml:space="preserve"> </w:t>
+      </w:r>
+      <w:proofErr w:type="spellStart"/>
+      <w:r>
+        <w:t>timestamp</w:t>
+      </w:r>
+      <w:proofErr w:type="spellEnd"/>
+      <w:r>
+        <w:t xml:space="preserve"> </w:t>
+      </w:r>
+      <w:proofErr w:type="spellStart"/>
+      <w:r>
+        <w:t>without</w:t>
+      </w:r>
+      <w:proofErr w:type="spellEnd"/>
+      <w:r>
+        <w:t xml:space="preserve"> time zone NOT NULL,</w:t>
+      </w:r>
+    </w:p>
+    <w:p>
+      <w:r>
+        <w:t xml:space="preserve">    local </w:t>
+      </w:r>
+      <w:proofErr w:type="gramStart"/>
+      <w:r>
+        <w:t>VARCHAR(</w:t>
+      </w:r>
+      <w:proofErr w:type="gramEnd"/>
+      <w:r>
+        <w:t>100) NOT NULL,</w:t>
+      </w:r>
+    </w:p>
+    <w:p>
+      <w:r>
+        <w:lastRenderedPageBreak/>
+        <w:t xml:space="preserve">    </w:t>
+      </w:r>
+      <w:proofErr w:type="spellStart"/>
+      <w:r>
+        <w:t>tipo_de_lixo</w:t>
+      </w:r>
+      <w:proofErr w:type="spellEnd"/>
+      <w:r>
+        <w:t xml:space="preserve"> </w:t>
+      </w:r>
+      <w:proofErr w:type="gramStart"/>
+      <w:r>
+        <w:t>VARCHAR(</w:t>
+      </w:r>
+      <w:proofErr w:type="gramEnd"/>
+      <w:r>
+        <w:t>100) NOT NULL,</w:t>
+      </w:r>
+    </w:p>
+    <w:p>
+      <w:r>
+        <w:t xml:space="preserve">    </w:t>
+      </w:r>
+      <w:proofErr w:type="spellStart"/>
+      <w:r>
+        <w:t>catador_id</w:t>
+      </w:r>
+      <w:proofErr w:type="spellEnd"/>
+      <w:r>
+        <w:t xml:space="preserve"> </w:t>
+      </w:r>
+      <w:proofErr w:type="spellStart"/>
+      <w:r>
+        <w:t>integer</w:t>
+      </w:r>
+      <w:proofErr w:type="spellEnd"/>
+      <w:r>
+        <w:t xml:space="preserve"> </w:t>
+      </w:r>
+      <w:proofErr w:type="spellStart"/>
+      <w:r>
+        <w:t>not</w:t>
+      </w:r>
+      <w:proofErr w:type="spellEnd"/>
+      <w:r>
+        <w:t xml:space="preserve"> </w:t>
+      </w:r>
+      <w:proofErr w:type="spellStart"/>
+      <w:r>
+        <w:t>null</w:t>
+      </w:r>
+      <w:proofErr w:type="spellEnd"/>
+      <w:r>
+        <w:t xml:space="preserve"> </w:t>
+      </w:r>
+      <w:proofErr w:type="spellStart"/>
+      <w:r>
+        <w:t>references</w:t>
+      </w:r>
+      <w:proofErr w:type="spellEnd"/>
+      <w:r>
+        <w:t xml:space="preserve"> catador(id) </w:t>
+      </w:r>
+      <w:proofErr w:type="spellStart"/>
+      <w:r>
+        <w:t>on</w:t>
+      </w:r>
+      <w:proofErr w:type="spellEnd"/>
+      <w:r>
+        <w:t xml:space="preserve"> update </w:t>
+      </w:r>
+      <w:proofErr w:type="spellStart"/>
+      <w:r>
+        <w:t>cascade</w:t>
+      </w:r>
+      <w:proofErr w:type="spellEnd"/>
+      <w:r>
+        <w:t>,</w:t>
+      </w:r>
+    </w:p>
+    <w:p>
+      <w:r>
+        <w:t xml:space="preserve">    </w:t>
+      </w:r>
+      <w:proofErr w:type="spellStart"/>
+      <w:r>
+        <w:t>reciclador_id</w:t>
+      </w:r>
+      <w:proofErr w:type="spellEnd"/>
+      <w:r>
+        <w:t xml:space="preserve"> </w:t>
+      </w:r>
+      <w:proofErr w:type="spellStart"/>
+      <w:r>
+        <w:t>integer</w:t>
+      </w:r>
+      <w:proofErr w:type="spellEnd"/>
+      <w:r>
+        <w:t xml:space="preserve"> </w:t>
+      </w:r>
+      <w:proofErr w:type="spellStart"/>
+      <w:r>
+        <w:t>not</w:t>
+      </w:r>
+      <w:proofErr w:type="spellEnd"/>
+      <w:r>
+        <w:t xml:space="preserve"> </w:t>
+      </w:r>
+      <w:proofErr w:type="spellStart"/>
+      <w:r>
+        <w:t>null</w:t>
+      </w:r>
+      <w:proofErr w:type="spellEnd"/>
+      <w:r>
+        <w:t xml:space="preserve"> </w:t>
+      </w:r>
+      <w:proofErr w:type="spellStart"/>
+      <w:r>
+        <w:t>references</w:t>
+      </w:r>
+      <w:proofErr w:type="spellEnd"/>
+      <w:r>
+        <w:t xml:space="preserve"> reciclador(id) </w:t>
+      </w:r>
+      <w:proofErr w:type="spellStart"/>
+      <w:r>
+        <w:t>on</w:t>
+      </w:r>
+      <w:proofErr w:type="spellEnd"/>
+      <w:r>
+        <w:t xml:space="preserve"> update </w:t>
+      </w:r>
+      <w:proofErr w:type="spellStart"/>
+      <w:r>
+        <w:t>cascade</w:t>
+      </w:r>
+      <w:proofErr w:type="spellEnd"/>
+    </w:p>
+    <w:p>
+      <w:r>
+        <w:t>);</w:t>
       </w:r>
     </w:p>
     <w:p/>
@@ -99,12 +707,17 @@
       </w:r>
       <w:proofErr w:type="spellStart"/>
       <w:r>
-        <w:t>ponto_coleta</w:t>
+        <w:t>ponto_</w:t>
+      </w:r>
+      <w:proofErr w:type="gramStart"/>
+      <w:r>
+        <w:t>coleta</w:t>
       </w:r>
       <w:proofErr w:type="spellEnd"/>
       <w:r>
         <w:t>(</w:t>
       </w:r>
+      <w:proofErr w:type="gramEnd"/>
     </w:p>
     <w:p>
       <w:r>
@@ -150,12 +763,28 @@
       </w:r>
       <w:proofErr w:type="spellEnd"/>
       <w:r>
-        <w:t xml:space="preserve"> VAR CHAR(100) NOT NULL,</w:t>
-      </w:r>
-    </w:p>
-    <w:p>
-      <w:r>
-        <w:t xml:space="preserve">    bairro VAR CHAR(100) NOT NULL,</w:t>
+        <w:t xml:space="preserve"> </w:t>
+      </w:r>
+      <w:proofErr w:type="gramStart"/>
+      <w:r>
+        <w:t>VARCHAR(</w:t>
+      </w:r>
+      <w:proofErr w:type="gramEnd"/>
+      <w:r>
+        <w:t>100) NOT NULL,</w:t>
+      </w:r>
+    </w:p>
+    <w:p>
+      <w:r>
+        <w:t xml:space="preserve">    bairro </w:t>
+      </w:r>
+      <w:proofErr w:type="gramStart"/>
+      <w:r>
+        <w:t>VARCHAR(</w:t>
+      </w:r>
+      <w:proofErr w:type="gramEnd"/>
+      <w:r>
+        <w:t>100) NOT NULL,</w:t>
       </w:r>
     </w:p>
     <w:p>
@@ -168,14 +797,88 @@
       </w:r>
       <w:proofErr w:type="spellEnd"/>
       <w:r>
-        <w:t xml:space="preserve"> VAR CHAR(10) NOT NULL,</w:t>
-      </w:r>
-    </w:p>
-    <w:p>
-      <w:r>
-        <w:t xml:space="preserve">    UNIQUE(</w:t>
-      </w:r>
-      <w:proofErr w:type="spellStart"/>
+        <w:t xml:space="preserve"> </w:t>
+      </w:r>
+      <w:proofErr w:type="gramStart"/>
+      <w:r>
+        <w:t>VARCHAR(</w:t>
+      </w:r>
+      <w:proofErr w:type="gramEnd"/>
+      <w:r>
+        <w:t>10) NOT NULL,</w:t>
+      </w:r>
+    </w:p>
+    <w:p>
+      <w:r>
+        <w:t xml:space="preserve">    </w:t>
+      </w:r>
+      <w:proofErr w:type="spellStart"/>
+      <w:r>
+        <w:t>pessoa_id</w:t>
+      </w:r>
+      <w:proofErr w:type="spellEnd"/>
+      <w:r>
+        <w:t xml:space="preserve"> </w:t>
+      </w:r>
+      <w:proofErr w:type="spellStart"/>
+      <w:r>
+        <w:t>integer</w:t>
+      </w:r>
+      <w:proofErr w:type="spellEnd"/>
+      <w:r>
+        <w:t xml:space="preserve"> </w:t>
+      </w:r>
+      <w:proofErr w:type="spellStart"/>
+      <w:r>
+        <w:t>not</w:t>
+      </w:r>
+      <w:proofErr w:type="spellEnd"/>
+      <w:r>
+        <w:t xml:space="preserve"> </w:t>
+      </w:r>
+      <w:proofErr w:type="spellStart"/>
+      <w:r>
+        <w:t>null</w:t>
+      </w:r>
+      <w:proofErr w:type="spellEnd"/>
+      <w:r>
+        <w:t xml:space="preserve"> </w:t>
+      </w:r>
+      <w:proofErr w:type="spellStart"/>
+      <w:r>
+        <w:t>references</w:t>
+      </w:r>
+      <w:proofErr w:type="spellEnd"/>
+      <w:r>
+        <w:t xml:space="preserve"> pessoa(id) </w:t>
+      </w:r>
+      <w:proofErr w:type="spellStart"/>
+      <w:r>
+        <w:t>on</w:t>
+      </w:r>
+      <w:proofErr w:type="spellEnd"/>
+      <w:r>
+        <w:t xml:space="preserve"> update </w:t>
+      </w:r>
+      <w:proofErr w:type="spellStart"/>
+      <w:r>
+        <w:t>cascade</w:t>
+      </w:r>
+      <w:proofErr w:type="spellEnd"/>
+      <w:r>
+        <w:t>,</w:t>
+      </w:r>
+    </w:p>
+    <w:p>
+      <w:r>
+        <w:t xml:space="preserve">    </w:t>
+      </w:r>
+      <w:proofErr w:type="gramStart"/>
+      <w:r>
+        <w:t>UNIQUE(</w:t>
+      </w:r>
+      <w:proofErr w:type="spellStart"/>
+      <w:proofErr w:type="gramEnd"/>
       <w:r>
         <w:t>endereco</w:t>
       </w:r>
@@ -200,639 +903,6 @@
     <w:p/>
     <w:p>
       <w:r>
-        <w:lastRenderedPageBreak/>
-        <w:t>CREATE TABLE pessoa(</w:t>
-      </w:r>
-    </w:p>
-    <w:p>
-      <w:r>
-        <w:t xml:space="preserve">    id serial PRIMARY KEY,</w:t>
-      </w:r>
-    </w:p>
-    <w:p>
-      <w:r>
-        <w:t xml:space="preserve">    </w:t>
-      </w:r>
-      <w:proofErr w:type="spellStart"/>
-      <w:r>
-        <w:t>email</w:t>
-      </w:r>
-      <w:proofErr w:type="spellEnd"/>
-      <w:r>
-        <w:t xml:space="preserve"> VAR CHAR(100) NOT NULL UNIQUE,</w:t>
-      </w:r>
-    </w:p>
-    <w:p>
-      <w:r>
-        <w:t xml:space="preserve">    senha VAR CHAR(100),</w:t>
-      </w:r>
-    </w:p>
-    <w:p>
-      <w:r>
-        <w:t xml:space="preserve">    telefone VAR CHAR(15),</w:t>
-      </w:r>
-    </w:p>
-    <w:p>
-      <w:r>
-        <w:t xml:space="preserve">    </w:t>
-      </w:r>
-      <w:proofErr w:type="spellStart"/>
-      <w:r>
-        <w:t>endereco</w:t>
-      </w:r>
-      <w:proofErr w:type="spellEnd"/>
-      <w:r>
-        <w:t xml:space="preserve"> VAR CHAR(100) NOT NULL,</w:t>
-      </w:r>
-    </w:p>
-    <w:p>
-      <w:r>
-        <w:t xml:space="preserve">    bairro VAR CHAR(100) NOT NULL,</w:t>
-      </w:r>
-    </w:p>
-    <w:p>
-      <w:r>
-        <w:t xml:space="preserve">    </w:t>
-      </w:r>
-      <w:proofErr w:type="spellStart"/>
-      <w:r>
-        <w:t>numero</w:t>
-      </w:r>
-      <w:proofErr w:type="spellEnd"/>
-      <w:r>
-        <w:t xml:space="preserve"> VAR CHAR(10) NOT NULL,</w:t>
-      </w:r>
-    </w:p>
-    <w:p>
-      <w:r>
-        <w:t>);</w:t>
-      </w:r>
-    </w:p>
-    <w:p/>
-    <w:p>
-      <w:r>
-        <w:t>CREATE TABLE catador(</w:t>
-      </w:r>
-    </w:p>
-    <w:p>
-      <w:r>
-        <w:t xml:space="preserve">    id serial PRIMARY KEY,</w:t>
-      </w:r>
-    </w:p>
-    <w:p>
-      <w:r>
-        <w:t xml:space="preserve">    tipo VAR CHAR (100),</w:t>
-      </w:r>
-    </w:p>
-    <w:p>
-      <w:r>
-        <w:t xml:space="preserve">    </w:t>
-      </w:r>
-      <w:proofErr w:type="spellStart"/>
-      <w:r>
-        <w:t>descricao</w:t>
-      </w:r>
-      <w:proofErr w:type="spellEnd"/>
-      <w:r>
-        <w:t xml:space="preserve"> VAR CHAR(100),</w:t>
-      </w:r>
-    </w:p>
-    <w:p>
-      <w:r>
-        <w:t xml:space="preserve">    </w:t>
-      </w:r>
-      <w:proofErr w:type="spellStart"/>
-      <w:r>
-        <w:t>pessoa_id</w:t>
-      </w:r>
-      <w:proofErr w:type="spellEnd"/>
-      <w:r>
-        <w:t xml:space="preserve"> </w:t>
-      </w:r>
-      <w:proofErr w:type="spellStart"/>
-      <w:r>
-        <w:t>integer</w:t>
-      </w:r>
-      <w:proofErr w:type="spellEnd"/>
-      <w:r>
-        <w:t xml:space="preserve"> </w:t>
-      </w:r>
-      <w:proofErr w:type="spellStart"/>
-      <w:r>
-        <w:t>not</w:t>
-      </w:r>
-      <w:proofErr w:type="spellEnd"/>
-      <w:r>
-        <w:t xml:space="preserve"> </w:t>
-      </w:r>
-      <w:proofErr w:type="spellStart"/>
-      <w:r>
-        <w:t>null</w:t>
-      </w:r>
-      <w:proofErr w:type="spellEnd"/>
-      <w:r>
-        <w:t xml:space="preserve"> </w:t>
-      </w:r>
-      <w:proofErr w:type="spellStart"/>
-      <w:r>
-        <w:t>references</w:t>
-      </w:r>
-      <w:proofErr w:type="spellEnd"/>
-      <w:r>
-        <w:t xml:space="preserve"> pessoa(id) </w:t>
-      </w:r>
-      <w:proofErr w:type="spellStart"/>
-      <w:r>
-        <w:t>on</w:t>
-      </w:r>
-      <w:proofErr w:type="spellEnd"/>
-      <w:r>
-        <w:t xml:space="preserve"> update </w:t>
-      </w:r>
-      <w:proofErr w:type="spellStart"/>
-      <w:r>
-        <w:t>cascade</w:t>
-      </w:r>
-      <w:proofErr w:type="spellEnd"/>
-    </w:p>
-    <w:p>
-      <w:r>
-        <w:t>);</w:t>
-      </w:r>
-    </w:p>
-    <w:p/>
-    <w:p>
-      <w:r>
-        <w:t>CREATE TABLE reciclador(</w:t>
-      </w:r>
-    </w:p>
-    <w:p>
-      <w:r>
-        <w:t xml:space="preserve">    id serial PRIMARY KEY,</w:t>
-      </w:r>
-    </w:p>
-    <w:p>
-      <w:r>
-        <w:t xml:space="preserve">    </w:t>
-      </w:r>
-      <w:proofErr w:type="spellStart"/>
-      <w:r>
-        <w:t>Afilhado_id</w:t>
-      </w:r>
-      <w:proofErr w:type="spellEnd"/>
-      <w:r>
-        <w:t xml:space="preserve"> </w:t>
-      </w:r>
-      <w:proofErr w:type="spellStart"/>
-      <w:r>
-        <w:t>integer</w:t>
-      </w:r>
-      <w:proofErr w:type="spellEnd"/>
-      <w:r>
-        <w:t xml:space="preserve"> </w:t>
-      </w:r>
-      <w:proofErr w:type="spellStart"/>
-      <w:r>
-        <w:t>not</w:t>
-      </w:r>
-      <w:proofErr w:type="spellEnd"/>
-      <w:r>
-        <w:t xml:space="preserve"> </w:t>
-      </w:r>
-      <w:proofErr w:type="spellStart"/>
-      <w:r>
-        <w:t>nyll</w:t>
-      </w:r>
-      <w:proofErr w:type="spellEnd"/>
-      <w:r>
-        <w:t xml:space="preserve"> </w:t>
-      </w:r>
-      <w:proofErr w:type="spellStart"/>
-      <w:r>
-        <w:t>references</w:t>
-      </w:r>
-      <w:proofErr w:type="spellEnd"/>
-      <w:r>
-        <w:t xml:space="preserve"> catador(id) </w:t>
-      </w:r>
-      <w:proofErr w:type="spellStart"/>
-      <w:r>
-        <w:t>on</w:t>
-      </w:r>
-      <w:proofErr w:type="spellEnd"/>
-      <w:r>
-        <w:t xml:space="preserve"> update </w:t>
-      </w:r>
-      <w:proofErr w:type="spellStart"/>
-      <w:r>
-        <w:t>cascade</w:t>
-      </w:r>
-      <w:proofErr w:type="spellEnd"/>
-      <w:r>
-        <w:t>,</w:t>
-      </w:r>
-    </w:p>
-    <w:p>
-      <w:r>
-        <w:t xml:space="preserve">    </w:t>
-      </w:r>
-      <w:proofErr w:type="spellStart"/>
-      <w:r>
-        <w:t>pessoa_id</w:t>
-      </w:r>
-      <w:proofErr w:type="spellEnd"/>
-      <w:r>
-        <w:t xml:space="preserve"> </w:t>
-      </w:r>
-      <w:proofErr w:type="spellStart"/>
-      <w:r>
-        <w:t>integer</w:t>
-      </w:r>
-      <w:proofErr w:type="spellEnd"/>
-      <w:r>
-        <w:t xml:space="preserve"> </w:t>
-      </w:r>
-      <w:proofErr w:type="spellStart"/>
-      <w:r>
-        <w:t>not</w:t>
-      </w:r>
-      <w:proofErr w:type="spellEnd"/>
-      <w:r>
-        <w:t xml:space="preserve"> </w:t>
-      </w:r>
-      <w:proofErr w:type="spellStart"/>
-      <w:r>
-        <w:t>null</w:t>
-      </w:r>
-      <w:proofErr w:type="spellEnd"/>
-      <w:r>
-        <w:t xml:space="preserve"> </w:t>
-      </w:r>
-      <w:proofErr w:type="spellStart"/>
-      <w:r>
-        <w:t>references</w:t>
-      </w:r>
-      <w:proofErr w:type="spellEnd"/>
-      <w:r>
-        <w:t xml:space="preserve"> pessoa(id) </w:t>
-      </w:r>
-      <w:proofErr w:type="spellStart"/>
-      <w:r>
-        <w:t>on</w:t>
-      </w:r>
-      <w:proofErr w:type="spellEnd"/>
-      <w:r>
-        <w:t xml:space="preserve"> update </w:t>
-      </w:r>
-      <w:proofErr w:type="spellStart"/>
-      <w:r>
-        <w:t>cascade</w:t>
-      </w:r>
-      <w:proofErr w:type="spellEnd"/>
-    </w:p>
-    <w:p>
-      <w:r>
-        <w:lastRenderedPageBreak/>
-        <w:t>);</w:t>
-      </w:r>
-    </w:p>
-    <w:p/>
-    <w:p>
-      <w:r>
-        <w:t>CREATE TABLE coleta(</w:t>
-      </w:r>
-    </w:p>
-    <w:p>
-      <w:r>
-        <w:t xml:space="preserve">    id serial PRIMARY KEY,</w:t>
-      </w:r>
-    </w:p>
-    <w:p>
-      <w:r>
-        <w:t xml:space="preserve">    </w:t>
-      </w:r>
-      <w:proofErr w:type="spellStart"/>
-      <w:r>
-        <w:t>data_e_hora</w:t>
-      </w:r>
-      <w:proofErr w:type="spellEnd"/>
-      <w:r>
-        <w:t xml:space="preserve"> </w:t>
-      </w:r>
-      <w:proofErr w:type="spellStart"/>
-      <w:r>
-        <w:t>timestamp</w:t>
-      </w:r>
-      <w:proofErr w:type="spellEnd"/>
-      <w:r>
-        <w:t xml:space="preserve"> </w:t>
-      </w:r>
-      <w:proofErr w:type="spellStart"/>
-      <w:r>
-        <w:t>without</w:t>
-      </w:r>
-      <w:proofErr w:type="spellEnd"/>
-      <w:r>
-        <w:t xml:space="preserve"> time zone NOT NULL,</w:t>
-      </w:r>
-    </w:p>
-    <w:p>
-      <w:r>
-        <w:t xml:space="preserve">    local VAR CHAR(100) NOT NULL,</w:t>
-      </w:r>
-    </w:p>
-    <w:p>
-      <w:r>
-        <w:t xml:space="preserve">    </w:t>
-      </w:r>
-      <w:proofErr w:type="spellStart"/>
-      <w:r>
-        <w:t>tipo_de_lixo</w:t>
-      </w:r>
-      <w:proofErr w:type="spellEnd"/>
-      <w:r>
-        <w:t xml:space="preserve"> VAR CHAR(100) NOT NULL,</w:t>
-      </w:r>
-    </w:p>
-    <w:p>
-      <w:r>
-        <w:t xml:space="preserve">    </w:t>
-      </w:r>
-      <w:proofErr w:type="spellStart"/>
-      <w:r>
-        <w:t>catador_id</w:t>
-      </w:r>
-      <w:proofErr w:type="spellEnd"/>
-      <w:r>
-        <w:t xml:space="preserve"> </w:t>
-      </w:r>
-      <w:proofErr w:type="spellStart"/>
-      <w:r>
-        <w:t>integer</w:t>
-      </w:r>
-      <w:proofErr w:type="spellEnd"/>
-      <w:r>
-        <w:t xml:space="preserve"> </w:t>
-      </w:r>
-      <w:proofErr w:type="spellStart"/>
-      <w:r>
-        <w:t>not</w:t>
-      </w:r>
-      <w:proofErr w:type="spellEnd"/>
-      <w:r>
-        <w:t xml:space="preserve"> </w:t>
-      </w:r>
-      <w:proofErr w:type="spellStart"/>
-      <w:r>
-        <w:t>null</w:t>
-      </w:r>
-      <w:proofErr w:type="spellEnd"/>
-      <w:r>
-        <w:t xml:space="preserve"> </w:t>
-      </w:r>
-      <w:proofErr w:type="spellStart"/>
-      <w:r>
-        <w:t>references</w:t>
-      </w:r>
-      <w:proofErr w:type="spellEnd"/>
-      <w:r>
-        <w:t xml:space="preserve"> catador(id) </w:t>
-      </w:r>
-      <w:proofErr w:type="spellStart"/>
-      <w:r>
-        <w:t>on</w:t>
-      </w:r>
-      <w:proofErr w:type="spellEnd"/>
-      <w:r>
-        <w:t xml:space="preserve"> update </w:t>
-      </w:r>
-      <w:proofErr w:type="spellStart"/>
-      <w:r>
-        <w:t>cascade</w:t>
-      </w:r>
-      <w:proofErr w:type="spellEnd"/>
-      <w:r>
-        <w:t>,</w:t>
-      </w:r>
-    </w:p>
-    <w:p>
-      <w:r>
-        <w:t xml:space="preserve">    </w:t>
-      </w:r>
-      <w:proofErr w:type="spellStart"/>
-      <w:r>
-        <w:t>reciclador_id</w:t>
-      </w:r>
-      <w:proofErr w:type="spellEnd"/>
-      <w:r>
-        <w:t xml:space="preserve"> </w:t>
-      </w:r>
-      <w:proofErr w:type="spellStart"/>
-      <w:r>
-        <w:t>integer</w:t>
-      </w:r>
-      <w:proofErr w:type="spellEnd"/>
-      <w:r>
-        <w:t xml:space="preserve"> </w:t>
-      </w:r>
-      <w:proofErr w:type="spellStart"/>
-      <w:r>
-        <w:t>not</w:t>
-      </w:r>
-      <w:proofErr w:type="spellEnd"/>
-      <w:r>
-        <w:t xml:space="preserve"> </w:t>
-      </w:r>
-      <w:proofErr w:type="spellStart"/>
-      <w:r>
-        <w:t>null</w:t>
-      </w:r>
-      <w:proofErr w:type="spellEnd"/>
-      <w:r>
-        <w:t xml:space="preserve"> </w:t>
-      </w:r>
-      <w:proofErr w:type="spellStart"/>
-      <w:r>
-        <w:t>references</w:t>
-      </w:r>
-      <w:proofErr w:type="spellEnd"/>
-      <w:r>
-        <w:t xml:space="preserve"> reciclador(id) </w:t>
-      </w:r>
-      <w:proofErr w:type="spellStart"/>
-      <w:r>
-        <w:t>on</w:t>
-      </w:r>
-      <w:proofErr w:type="spellEnd"/>
-      <w:r>
-        <w:t xml:space="preserve"> update </w:t>
-      </w:r>
-      <w:proofErr w:type="spellStart"/>
-      <w:r>
-        <w:t>cascade</w:t>
-      </w:r>
-      <w:proofErr w:type="spellEnd"/>
-    </w:p>
-    <w:p>
-      <w:r>
-        <w:t>);</w:t>
-      </w:r>
-    </w:p>
-    <w:p/>
-    <w:p>
-      <w:r>
-        <w:t xml:space="preserve">CREATE TABLE </w:t>
-      </w:r>
-      <w:proofErr w:type="spellStart"/>
-      <w:r>
-        <w:t>ponto_coleta_pessoa</w:t>
-      </w:r>
-      <w:proofErr w:type="spellEnd"/>
-      <w:r>
-        <w:t>(</w:t>
-      </w:r>
-    </w:p>
-    <w:p>
-      <w:r>
-        <w:t xml:space="preserve">    id serial PRIMARY KEY,</w:t>
-      </w:r>
-    </w:p>
-    <w:p>
-      <w:r>
-        <w:t xml:space="preserve">    </w:t>
-      </w:r>
-      <w:proofErr w:type="spellStart"/>
-      <w:r>
-        <w:t>ponto_coleta_id</w:t>
-      </w:r>
-      <w:proofErr w:type="spellEnd"/>
-      <w:r>
-        <w:t xml:space="preserve"> </w:t>
-      </w:r>
-      <w:proofErr w:type="spellStart"/>
-      <w:r>
-        <w:t>integer</w:t>
-      </w:r>
-      <w:proofErr w:type="spellEnd"/>
-      <w:r>
-        <w:t xml:space="preserve"> </w:t>
-      </w:r>
-      <w:proofErr w:type="spellStart"/>
-      <w:r>
-        <w:t>not</w:t>
-      </w:r>
-      <w:proofErr w:type="spellEnd"/>
-      <w:r>
-        <w:t xml:space="preserve"> </w:t>
-      </w:r>
-      <w:proofErr w:type="spellStart"/>
-      <w:r>
-        <w:t>null</w:t>
-      </w:r>
-      <w:proofErr w:type="spellEnd"/>
-      <w:r>
-        <w:t xml:space="preserve"> </w:t>
-      </w:r>
-      <w:proofErr w:type="spellStart"/>
-      <w:r>
-        <w:t>references</w:t>
-      </w:r>
-      <w:proofErr w:type="spellEnd"/>
-      <w:r>
-        <w:t xml:space="preserve"> </w:t>
-      </w:r>
-      <w:proofErr w:type="spellStart"/>
-      <w:r>
-        <w:t>ponto_coleta</w:t>
-      </w:r>
-      <w:proofErr w:type="spellEnd"/>
-      <w:r>
-        <w:t xml:space="preserve">(id) </w:t>
-      </w:r>
-      <w:proofErr w:type="spellStart"/>
-      <w:r>
-        <w:t>on</w:t>
-      </w:r>
-      <w:proofErr w:type="spellEnd"/>
-      <w:r>
-        <w:t xml:space="preserve"> update </w:t>
-      </w:r>
-      <w:proofErr w:type="spellStart"/>
-      <w:r>
-        <w:t>cascade</w:t>
-      </w:r>
-      <w:proofErr w:type="spellEnd"/>
-      <w:r>
-        <w:t>,</w:t>
-      </w:r>
-    </w:p>
-    <w:p>
-      <w:r>
-        <w:t xml:space="preserve">    </w:t>
-      </w:r>
-      <w:proofErr w:type="spellStart"/>
-      <w:r>
-        <w:t>pessoa_id</w:t>
-      </w:r>
-      <w:proofErr w:type="spellEnd"/>
-      <w:r>
-        <w:t xml:space="preserve"> </w:t>
-      </w:r>
-      <w:proofErr w:type="spellStart"/>
-      <w:r>
-        <w:t>integer</w:t>
-      </w:r>
-      <w:proofErr w:type="spellEnd"/>
-      <w:r>
-        <w:t xml:space="preserve"> </w:t>
-      </w:r>
-      <w:proofErr w:type="spellStart"/>
-      <w:r>
-        <w:t>not</w:t>
-      </w:r>
-      <w:proofErr w:type="spellEnd"/>
-      <w:r>
-        <w:t xml:space="preserve"> </w:t>
-      </w:r>
-      <w:proofErr w:type="spellStart"/>
-      <w:r>
-        <w:t>null</w:t>
-      </w:r>
-      <w:proofErr w:type="spellEnd"/>
-      <w:r>
-        <w:t xml:space="preserve"> </w:t>
-      </w:r>
-      <w:proofErr w:type="spellStart"/>
-      <w:r>
-        <w:t>references</w:t>
-      </w:r>
-      <w:proofErr w:type="spellEnd"/>
-      <w:r>
-        <w:t xml:space="preserve"> pessoa(id) </w:t>
-      </w:r>
-      <w:proofErr w:type="spellStart"/>
-      <w:r>
-        <w:t>on</w:t>
-      </w:r>
-      <w:proofErr w:type="spellEnd"/>
-      <w:r>
-        <w:t xml:space="preserve"> update </w:t>
-      </w:r>
-      <w:proofErr w:type="spellStart"/>
-      <w:r>
-        <w:t>cascade</w:t>
-      </w:r>
-      <w:proofErr w:type="spellEnd"/>
-    </w:p>
-    <w:p>
-      <w:r>
-        <w:t>);</w:t>
-      </w:r>
-    </w:p>
-    <w:p/>
-    <w:p/>
-    <w:p>
-      <w:r>
         <w:t>COMMIT;</w:t>
       </w:r>
     </w:p>
@@ -841,7 +911,6 @@
         <w:pStyle w:val="Ttulo1"/>
       </w:pPr>
       <w:r>
-        <w:lastRenderedPageBreak/>
         <w:t>A</w:t>
       </w:r>
       <w:r>
@@ -895,6 +964,7 @@
                 <w:sz w:val="24"/>
                 <w:szCs w:val="24"/>
               </w:rPr>
+              <w:lastRenderedPageBreak/>
               <w:t>Nome</w:t>
             </w:r>
           </w:p>
@@ -995,7 +1065,7 @@
 </file>
 
 <file path=word/endnotes.xml><?xml version="1.0" encoding="utf-8"?>
-<w:endnotes xmlns:wpc="http://schemas.microsoft.com/office/word/2010/wordprocessingCanvas" xmlns:cx="http://schemas.microsoft.com/office/drawing/2014/chartex" xmlns:cx1="http://schemas.microsoft.com/office/drawing/2015/9/8/chartex" xmlns:cx2="http://schemas.microsoft.com/office/drawing/2015/10/21/chartex" xmlns:cx3="http://schemas.microsoft.com/office/drawing/2016/5/9/chartex" xmlns:cx4="http://schemas.microsoft.com/office/drawing/2016/5/10/chartex" xmlns:cx5="http://schemas.microsoft.com/office/drawing/2016/5/11/chartex" xmlns:cx6="http://schemas.microsoft.com/office/drawing/2016/5/12/chartex" xmlns:cx7="http://schemas.microsoft.com/office/drawing/2016/5/13/chartex" xmlns:cx8="http://schemas.microsoft.com/office/drawing/2016/5/14/chartex" xmlns:mc="http://schemas.openxmlformats.org/markup-compatibility/2006" xmlns:aink="http://schemas.microsoft.com/office/drawing/2016/ink" xmlns:am3d="http://schemas.microsoft.com/office/drawing/2017/model3d" xmlns:o="urn:schemas-microsoft-com:office:office" xmlns:r="http://schemas.openxmlformats.org/officeDocument/2006/relationships" xmlns:m="http://schemas.openxmlformats.org/officeDocument/2006/math" xmlns:v="urn:schemas-microsoft-com:vml" xmlns:wp14="http://schemas.microsoft.com/office/word/2010/wordprocessingDrawing" xmlns:wp="http://schemas.openxmlformats.org/drawingml/2006/wordprocessingDrawing" xmlns:w10="urn:schemas-microsoft-com:office:word" xmlns:w="http://schemas.openxmlformats.org/wordprocessingml/2006/main" xmlns:w14="http://schemas.microsoft.com/office/word/2010/wordml" xmlns:w15="http://schemas.microsoft.com/office/word/2012/wordml" xmlns:w16cex="http://schemas.microsoft.com/office/word/2018/wordml/cex" xmlns:w16cid="http://schemas.microsoft.com/office/word/2016/wordml/cid" xmlns:w16="http://schemas.microsoft.com/office/word/2018/wordml" xmlns:w16sdtdh="http://schemas.microsoft.com/office/word/2020/wordml/sdtdatahash" xmlns:w16se="http://schemas.microsoft.com/office/word/2015/wordml/symex" xmlns:wpg="http://schemas.microsoft.com/office/word/2010/wordprocessingGroup" xmlns:wpi="http://schemas.microsoft.com/office/word/2010/wordprocessingInk" xmlns:wne="http://schemas.microsoft.com/office/word/2006/wordml" xmlns:wps="http://schemas.microsoft.com/office/word/2010/wordprocessingShape" mc:Ignorable="w14 w15 w16se w16cid w16 w16cex w16sdtdh wp14">
+<w:endnotes xmlns:wpc="http://schemas.microsoft.com/office/word/2010/wordprocessingCanvas" xmlns:cx="http://schemas.microsoft.com/office/drawing/2014/chartex" xmlns:cx1="http://schemas.microsoft.com/office/drawing/2015/9/8/chartex" xmlns:cx2="http://schemas.microsoft.com/office/drawing/2015/10/21/chartex" xmlns:cx3="http://schemas.microsoft.com/office/drawing/2016/5/9/chartex" xmlns:cx4="http://schemas.microsoft.com/office/drawing/2016/5/10/chartex" xmlns:cx5="http://schemas.microsoft.com/office/drawing/2016/5/11/chartex" xmlns:cx6="http://schemas.microsoft.com/office/drawing/2016/5/12/chartex" xmlns:cx7="http://schemas.microsoft.com/office/drawing/2016/5/13/chartex" xmlns:cx8="http://schemas.microsoft.com/office/drawing/2016/5/14/chartex" xmlns:mc="http://schemas.openxmlformats.org/markup-compatibility/2006" xmlns:aink="http://schemas.microsoft.com/office/drawing/2016/ink" xmlns:am3d="http://schemas.microsoft.com/office/drawing/2017/model3d" xmlns:o="urn:schemas-microsoft-com:office:office" xmlns:oel="http://schemas.microsoft.com/office/2019/extlst" xmlns:r="http://schemas.openxmlformats.org/officeDocument/2006/relationships" xmlns:m="http://schemas.openxmlformats.org/officeDocument/2006/math" xmlns:v="urn:schemas-microsoft-com:vml" xmlns:wp14="http://schemas.microsoft.com/office/word/2010/wordprocessingDrawing" xmlns:wp="http://schemas.openxmlformats.org/drawingml/2006/wordprocessingDrawing" xmlns:w10="urn:schemas-microsoft-com:office:word" xmlns:w="http://schemas.openxmlformats.org/wordprocessingml/2006/main" xmlns:w14="http://schemas.microsoft.com/office/word/2010/wordml" xmlns:w15="http://schemas.microsoft.com/office/word/2012/wordml" xmlns:w16cex="http://schemas.microsoft.com/office/word/2018/wordml/cex" xmlns:w16cid="http://schemas.microsoft.com/office/word/2016/wordml/cid" xmlns:w16="http://schemas.microsoft.com/office/word/2018/wordml" xmlns:w16sdtdh="http://schemas.microsoft.com/office/word/2020/wordml/sdtdatahash" xmlns:w16se="http://schemas.microsoft.com/office/word/2015/wordml/symex" xmlns:wpg="http://schemas.microsoft.com/office/word/2010/wordprocessingGroup" xmlns:wpi="http://schemas.microsoft.com/office/word/2010/wordprocessingInk" xmlns:wne="http://schemas.microsoft.com/office/word/2006/wordml" xmlns:wps="http://schemas.microsoft.com/office/word/2010/wordprocessingShape" mc:Ignorable="w14 w15 w16se w16cid w16 w16cex w16sdtdh wp14">
   <w:endnote w:type="separator" w:id="-1">
     <w:p>
       <w:pPr>
@@ -1020,7 +1090,7 @@
 </file>
 
 <file path=word/footnotes.xml><?xml version="1.0" encoding="utf-8"?>
-<w:footnotes xmlns:wpc="http://schemas.microsoft.com/office/word/2010/wordprocessingCanvas" xmlns:cx="http://schemas.microsoft.com/office/drawing/2014/chartex" xmlns:cx1="http://schemas.microsoft.com/office/drawing/2015/9/8/chartex" xmlns:cx2="http://schemas.microsoft.com/office/drawing/2015/10/21/chartex" xmlns:cx3="http://schemas.microsoft.com/office/drawing/2016/5/9/chartex" xmlns:cx4="http://schemas.microsoft.com/office/drawing/2016/5/10/chartex" xmlns:cx5="http://schemas.microsoft.com/office/drawing/2016/5/11/chartex" xmlns:cx6="http://schemas.microsoft.com/office/drawing/2016/5/12/chartex" xmlns:cx7="http://schemas.microsoft.com/office/drawing/2016/5/13/chartex" xmlns:cx8="http://schemas.microsoft.com/office/drawing/2016/5/14/chartex" xmlns:mc="http://schemas.openxmlformats.org/markup-compatibility/2006" xmlns:aink="http://schemas.microsoft.com/office/drawing/2016/ink" xmlns:am3d="http://schemas.microsoft.com/office/drawing/2017/model3d" xmlns:o="urn:schemas-microsoft-com:office:office" xmlns:r="http://schemas.openxmlformats.org/officeDocument/2006/relationships" xmlns:m="http://schemas.openxmlformats.org/officeDocument/2006/math" xmlns:v="urn:schemas-microsoft-com:vml" xmlns:wp14="http://schemas.microsoft.com/office/word/2010/wordprocessingDrawing" xmlns:wp="http://schemas.openxmlformats.org/drawingml/2006/wordprocessingDrawing" xmlns:w10="urn:schemas-microsoft-com:office:word" xmlns:w="http://schemas.openxmlformats.org/wordprocessingml/2006/main" xmlns:w14="http://schemas.microsoft.com/office/word/2010/wordml" xmlns:w15="http://schemas.microsoft.com/office/word/2012/wordml" xmlns:w16cex="http://schemas.microsoft.com/office/word/2018/wordml/cex" xmlns:w16cid="http://schemas.microsoft.com/office/word/2016/wordml/cid" xmlns:w16="http://schemas.microsoft.com/office/word/2018/wordml" xmlns:w16sdtdh="http://schemas.microsoft.com/office/word/2020/wordml/sdtdatahash" xmlns:w16se="http://schemas.microsoft.com/office/word/2015/wordml/symex" xmlns:wpg="http://schemas.microsoft.com/office/word/2010/wordprocessingGroup" xmlns:wpi="http://schemas.microsoft.com/office/word/2010/wordprocessingInk" xmlns:wne="http://schemas.microsoft.com/office/word/2006/wordml" xmlns:wps="http://schemas.microsoft.com/office/word/2010/wordprocessingShape" mc:Ignorable="w14 w15 w16se w16cid w16 w16cex w16sdtdh wp14">
+<w:footnotes xmlns:wpc="http://schemas.microsoft.com/office/word/2010/wordprocessingCanvas" xmlns:cx="http://schemas.microsoft.com/office/drawing/2014/chartex" xmlns:cx1="http://schemas.microsoft.com/office/drawing/2015/9/8/chartex" xmlns:cx2="http://schemas.microsoft.com/office/drawing/2015/10/21/chartex" xmlns:cx3="http://schemas.microsoft.com/office/drawing/2016/5/9/chartex" xmlns:cx4="http://schemas.microsoft.com/office/drawing/2016/5/10/chartex" xmlns:cx5="http://schemas.microsoft.com/office/drawing/2016/5/11/chartex" xmlns:cx6="http://schemas.microsoft.com/office/drawing/2016/5/12/chartex" xmlns:cx7="http://schemas.microsoft.com/office/drawing/2016/5/13/chartex" xmlns:cx8="http://schemas.microsoft.com/office/drawing/2016/5/14/chartex" xmlns:mc="http://schemas.openxmlformats.org/markup-compatibility/2006" xmlns:aink="http://schemas.microsoft.com/office/drawing/2016/ink" xmlns:am3d="http://schemas.microsoft.com/office/drawing/2017/model3d" xmlns:o="urn:schemas-microsoft-com:office:office" xmlns:oel="http://schemas.microsoft.com/office/2019/extlst" xmlns:r="http://schemas.openxmlformats.org/officeDocument/2006/relationships" xmlns:m="http://schemas.openxmlformats.org/officeDocument/2006/math" xmlns:v="urn:schemas-microsoft-com:vml" xmlns:wp14="http://schemas.microsoft.com/office/word/2010/wordprocessingDrawing" xmlns:wp="http://schemas.openxmlformats.org/drawingml/2006/wordprocessingDrawing" xmlns:w10="urn:schemas-microsoft-com:office:word" xmlns:w="http://schemas.openxmlformats.org/wordprocessingml/2006/main" xmlns:w14="http://schemas.microsoft.com/office/word/2010/wordml" xmlns:w15="http://schemas.microsoft.com/office/word/2012/wordml" xmlns:w16cex="http://schemas.microsoft.com/office/word/2018/wordml/cex" xmlns:w16cid="http://schemas.microsoft.com/office/word/2016/wordml/cid" xmlns:w16="http://schemas.microsoft.com/office/word/2018/wordml" xmlns:w16sdtdh="http://schemas.microsoft.com/office/word/2020/wordml/sdtdatahash" xmlns:w16se="http://schemas.microsoft.com/office/word/2015/wordml/symex" xmlns:wpg="http://schemas.microsoft.com/office/word/2010/wordprocessingGroup" xmlns:wpi="http://schemas.microsoft.com/office/word/2010/wordprocessingInk" xmlns:wne="http://schemas.microsoft.com/office/word/2006/wordml" xmlns:wps="http://schemas.microsoft.com/office/word/2010/wordprocessingShape" mc:Ignorable="w14 w15 w16se w16cid w16 w16cex w16sdtdh wp14">
   <w:footnote w:type="separator" w:id="-1">
     <w:p>
       <w:pPr>
@@ -1045,7 +1115,7 @@
 </file>
 
 <file path=word/header1.xml><?xml version="1.0" encoding="utf-8"?>
-<w:hdr xmlns:wpc="http://schemas.microsoft.com/office/word/2010/wordprocessingCanvas" xmlns:cx="http://schemas.microsoft.com/office/drawing/2014/chartex" xmlns:cx1="http://schemas.microsoft.com/office/drawing/2015/9/8/chartex" xmlns:cx2="http://schemas.microsoft.com/office/drawing/2015/10/21/chartex" xmlns:cx3="http://schemas.microsoft.com/office/drawing/2016/5/9/chartex" xmlns:cx4="http://schemas.microsoft.com/office/drawing/2016/5/10/chartex" xmlns:cx5="http://schemas.microsoft.com/office/drawing/2016/5/11/chartex" xmlns:cx6="http://schemas.microsoft.com/office/drawing/2016/5/12/chartex" xmlns:cx7="http://schemas.microsoft.com/office/drawing/2016/5/13/chartex" xmlns:cx8="http://schemas.microsoft.com/office/drawing/2016/5/14/chartex" xmlns:mc="http://schemas.openxmlformats.org/markup-compatibility/2006" xmlns:aink="http://schemas.microsoft.com/office/drawing/2016/ink" xmlns:am3d="http://schemas.microsoft.com/office/drawing/2017/model3d" xmlns:o="urn:schemas-microsoft-com:office:office" xmlns:r="http://schemas.openxmlformats.org/officeDocument/2006/relationships" xmlns:m="http://schemas.openxmlformats.org/officeDocument/2006/math" xmlns:v="urn:schemas-microsoft-com:vml" xmlns:wp14="http://schemas.microsoft.com/office/word/2010/wordprocessingDrawing" xmlns:wp="http://schemas.openxmlformats.org/drawingml/2006/wordprocessingDrawing" xmlns:w10="urn:schemas-microsoft-com:office:word" xmlns:w="http://schemas.openxmlformats.org/wordprocessingml/2006/main" xmlns:w14="http://schemas.microsoft.com/office/word/2010/wordml" xmlns:w15="http://schemas.microsoft.com/office/word/2012/wordml" xmlns:w16cex="http://schemas.microsoft.com/office/word/2018/wordml/cex" xmlns:w16cid="http://schemas.microsoft.com/office/word/2016/wordml/cid" xmlns:w16="http://schemas.microsoft.com/office/word/2018/wordml" xmlns:w16sdtdh="http://schemas.microsoft.com/office/word/2020/wordml/sdtdatahash" xmlns:w16se="http://schemas.microsoft.com/office/word/2015/wordml/symex" xmlns:wpg="http://schemas.microsoft.com/office/word/2010/wordprocessingGroup" xmlns:wpi="http://schemas.microsoft.com/office/word/2010/wordprocessingInk" xmlns:wne="http://schemas.microsoft.com/office/word/2006/wordml" xmlns:wps="http://schemas.microsoft.com/office/word/2010/wordprocessingShape" mc:Ignorable="w14 w15 w16se w16cid w16 w16cex w16sdtdh wp14">
+<w:hdr xmlns:wpc="http://schemas.microsoft.com/office/word/2010/wordprocessingCanvas" xmlns:cx="http://schemas.microsoft.com/office/drawing/2014/chartex" xmlns:cx1="http://schemas.microsoft.com/office/drawing/2015/9/8/chartex" xmlns:cx2="http://schemas.microsoft.com/office/drawing/2015/10/21/chartex" xmlns:cx3="http://schemas.microsoft.com/office/drawing/2016/5/9/chartex" xmlns:cx4="http://schemas.microsoft.com/office/drawing/2016/5/10/chartex" xmlns:cx5="http://schemas.microsoft.com/office/drawing/2016/5/11/chartex" xmlns:cx6="http://schemas.microsoft.com/office/drawing/2016/5/12/chartex" xmlns:cx7="http://schemas.microsoft.com/office/drawing/2016/5/13/chartex" xmlns:cx8="http://schemas.microsoft.com/office/drawing/2016/5/14/chartex" xmlns:mc="http://schemas.openxmlformats.org/markup-compatibility/2006" xmlns:aink="http://schemas.microsoft.com/office/drawing/2016/ink" xmlns:am3d="http://schemas.microsoft.com/office/drawing/2017/model3d" xmlns:o="urn:schemas-microsoft-com:office:office" xmlns:oel="http://schemas.microsoft.com/office/2019/extlst" xmlns:r="http://schemas.openxmlformats.org/officeDocument/2006/relationships" xmlns:m="http://schemas.openxmlformats.org/officeDocument/2006/math" xmlns:v="urn:schemas-microsoft-com:vml" xmlns:wp14="http://schemas.microsoft.com/office/word/2010/wordprocessingDrawing" xmlns:wp="http://schemas.openxmlformats.org/drawingml/2006/wordprocessingDrawing" xmlns:w10="urn:schemas-microsoft-com:office:word" xmlns:w="http://schemas.openxmlformats.org/wordprocessingml/2006/main" xmlns:w14="http://schemas.microsoft.com/office/word/2010/wordml" xmlns:w15="http://schemas.microsoft.com/office/word/2012/wordml" xmlns:w16cex="http://schemas.microsoft.com/office/word/2018/wordml/cex" xmlns:w16cid="http://schemas.microsoft.com/office/word/2016/wordml/cid" xmlns:w16="http://schemas.microsoft.com/office/word/2018/wordml" xmlns:w16sdtdh="http://schemas.microsoft.com/office/word/2020/wordml/sdtdatahash" xmlns:w16se="http://schemas.microsoft.com/office/word/2015/wordml/symex" xmlns:wpg="http://schemas.microsoft.com/office/word/2010/wordprocessingGroup" xmlns:wpi="http://schemas.microsoft.com/office/word/2010/wordprocessingInk" xmlns:wne="http://schemas.microsoft.com/office/word/2006/wordml" xmlns:wps="http://schemas.microsoft.com/office/word/2010/wordprocessingShape" mc:Ignorable="w14 w15 w16se w16cid w16 w16cex w16sdtdh wp14">
   <w:p>
     <w:pPr>
       <w:pStyle w:val="Cabealho"/>
@@ -1146,11 +1216,11 @@
         </mc:Choice>
         <mc:Fallback>
           <w:pict>
-            <v:shapetype id="_x0000_t202" coordsize="21600,21600" o:spt="202" path="m,l,21600r21600,l21600,xe">
+            <v:shapetype w14:anchorId="2677C5F6" id="_x0000_t202" coordsize="21600,21600" o:spt="202" path="m,l,21600r21600,l21600,xe">
               <v:stroke joinstyle="miter"/>
               <v:path gradientshapeok="t" o:connecttype="rect"/>
             </v:shapetype>
-            <v:shape id="Caixa de Texto 22" o:spid="_x0000_s1026" type="#_x0000_t202" style="position:absolute;margin-left:-24.5pt;margin-top:0;width:26.7pt;height:14.4pt;z-index:251659264;visibility:visible;mso-wrap-style:square;mso-width-percent:0;mso-height-percent:0;mso-wrap-distance-left:9pt;mso-wrap-distance-top:0;mso-wrap-distance-right:9pt;mso-wrap-distance-bottom:0;mso-position-horizontal:right;mso-position-horizontal-relative:left-margin-area;mso-position-vertical:absolute;mso-position-vertical-relative:bottom-margin-area;mso-width-percent:0;mso-height-percent:0;mso-width-relative:margin;mso-height-relative:margin;v-text-anchor:top" o:gfxdata="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" filled="f" stroked="f" strokeweight=".5pt">
+            <v:shape id="Caixa de Texto 22" o:spid="_x0000_s1026" type="#_x0000_t202" style="position:absolute;margin-left:-24.5pt;margin-top:0;width:26.7pt;height:14.4pt;z-index:251659264;visibility:visible;mso-wrap-style:square;mso-width-percent:0;mso-height-percent:0;mso-wrap-distance-left:9pt;mso-wrap-distance-top:0;mso-wrap-distance-right:9pt;mso-wrap-distance-bottom:0;mso-position-horizontal:right;mso-position-horizontal-relative:left-margin-area;mso-position-vertical:absolute;mso-position-vertical-relative:bottom-margin-area;mso-width-percent:0;mso-height-percent:0;mso-width-relative:margin;mso-height-relative:margin;v-text-anchor:top" o:gfxdata="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" filled="f" stroked="f" strokeweight=".5pt">
               <v:textbox style="mso-fit-shape-to-text:t" inset="0,0,0,0">
                 <w:txbxContent>
                   <w:p>
@@ -1186,7 +1256,7 @@
 </file>
 
 <file path=word/numbering.xml><?xml version="1.0" encoding="utf-8"?>
-<w:numbering xmlns:wpc="http://schemas.microsoft.com/office/word/2010/wordprocessingCanvas" xmlns:cx="http://schemas.microsoft.com/office/drawing/2014/chartex" xmlns:cx1="http://schemas.microsoft.com/office/drawing/2015/9/8/chartex" xmlns:cx2="http://schemas.microsoft.com/office/drawing/2015/10/21/chartex" xmlns:cx3="http://schemas.microsoft.com/office/drawing/2016/5/9/chartex" xmlns:cx4="http://schemas.microsoft.com/office/drawing/2016/5/10/chartex" xmlns:cx5="http://schemas.microsoft.com/office/drawing/2016/5/11/chartex" xmlns:cx6="http://schemas.microsoft.com/office/drawing/2016/5/12/chartex" xmlns:cx7="http://schemas.microsoft.com/office/drawing/2016/5/13/chartex" xmlns:cx8="http://schemas.microsoft.com/office/drawing/2016/5/14/chartex" xmlns:mc="http://schemas.openxmlformats.org/markup-compatibility/2006" xmlns:aink="http://schemas.microsoft.com/office/drawing/2016/ink" xmlns:am3d="http://schemas.microsoft.com/office/drawing/2017/model3d" xmlns:o="urn:schemas-microsoft-com:office:office" xmlns:r="http://schemas.openxmlformats.org/officeDocument/2006/relationships" xmlns:m="http://schemas.openxmlformats.org/officeDocument/2006/math" xmlns:v="urn:schemas-microsoft-com:vml" xmlns:wp14="http://schemas.microsoft.com/office/word/2010/wordprocessingDrawing" xmlns:wp="http://schemas.openxmlformats.org/drawingml/2006/wordprocessingDrawing" xmlns:w10="urn:schemas-microsoft-com:office:word" xmlns:w="http://schemas.openxmlformats.org/wordprocessingml/2006/main" xmlns:w14="http://schemas.microsoft.com/office/word/2010/wordml" xmlns:w15="http://schemas.microsoft.com/office/word/2012/wordml" xmlns:w16cex="http://schemas.microsoft.com/office/word/2018/wordml/cex" xmlns:w16cid="http://schemas.microsoft.com/office/word/2016/wordml/cid" xmlns:w16="http://schemas.microsoft.com/office/word/2018/wordml" xmlns:w16sdtdh="http://schemas.microsoft.com/office/word/2020/wordml/sdtdatahash" xmlns:w16se="http://schemas.microsoft.com/office/word/2015/wordml/symex" xmlns:wpg="http://schemas.microsoft.com/office/word/2010/wordprocessingGroup" xmlns:wpi="http://schemas.microsoft.com/office/word/2010/wordprocessingInk" xmlns:wne="http://schemas.microsoft.com/office/word/2006/wordml" xmlns:wps="http://schemas.microsoft.com/office/word/2010/wordprocessingShape" mc:Ignorable="w14 w15 w16se w16cid w16 w16cex w16sdtdh wp14">
+<w:numbering xmlns:wpc="http://schemas.microsoft.com/office/word/2010/wordprocessingCanvas" xmlns:cx="http://schemas.microsoft.com/office/drawing/2014/chartex" xmlns:cx1="http://schemas.microsoft.com/office/drawing/2015/9/8/chartex" xmlns:cx2="http://schemas.microsoft.com/office/drawing/2015/10/21/chartex" xmlns:cx3="http://schemas.microsoft.com/office/drawing/2016/5/9/chartex" xmlns:cx4="http://schemas.microsoft.com/office/drawing/2016/5/10/chartex" xmlns:cx5="http://schemas.microsoft.com/office/drawing/2016/5/11/chartex" xmlns:cx6="http://schemas.microsoft.com/office/drawing/2016/5/12/chartex" xmlns:cx7="http://schemas.microsoft.com/office/drawing/2016/5/13/chartex" xmlns:cx8="http://schemas.microsoft.com/office/drawing/2016/5/14/chartex" xmlns:mc="http://schemas.openxmlformats.org/markup-compatibility/2006" xmlns:aink="http://schemas.microsoft.com/office/drawing/2016/ink" xmlns:am3d="http://schemas.microsoft.com/office/drawing/2017/model3d" xmlns:o="urn:schemas-microsoft-com:office:office" xmlns:oel="http://schemas.microsoft.com/office/2019/extlst" xmlns:r="http://schemas.openxmlformats.org/officeDocument/2006/relationships" xmlns:m="http://schemas.openxmlformats.org/officeDocument/2006/math" xmlns:v="urn:schemas-microsoft-com:vml" xmlns:wp14="http://schemas.microsoft.com/office/word/2010/wordprocessingDrawing" xmlns:wp="http://schemas.openxmlformats.org/drawingml/2006/wordprocessingDrawing" xmlns:w10="urn:schemas-microsoft-com:office:word" xmlns:w="http://schemas.openxmlformats.org/wordprocessingml/2006/main" xmlns:w14="http://schemas.microsoft.com/office/word/2010/wordml" xmlns:w15="http://schemas.microsoft.com/office/word/2012/wordml" xmlns:w16cex="http://schemas.microsoft.com/office/word/2018/wordml/cex" xmlns:w16cid="http://schemas.microsoft.com/office/word/2016/wordml/cid" xmlns:w16="http://schemas.microsoft.com/office/word/2018/wordml" xmlns:w16sdtdh="http://schemas.microsoft.com/office/word/2020/wordml/sdtdatahash" xmlns:w16se="http://schemas.microsoft.com/office/word/2015/wordml/symex" xmlns:wpg="http://schemas.microsoft.com/office/word/2010/wordprocessingGroup" xmlns:wpi="http://schemas.microsoft.com/office/word/2010/wordprocessingInk" xmlns:wne="http://schemas.microsoft.com/office/word/2006/wordml" xmlns:wps="http://schemas.microsoft.com/office/word/2010/wordprocessingShape" mc:Ignorable="w14 w15 w16se w16cid w16 w16cex w16sdtdh wp14">
   <w:abstractNum w:abstractNumId="0" w15:restartNumberingAfterBreak="0">
     <w:nsid w:val="FFFFFF89"/>
     <w:multiLevelType w:val="singleLevel"/>
@@ -1599,22 +1669,22 @@
       </w:rPr>
     </w:lvl>
   </w:abstractNum>
-  <w:num w:numId="1">
+  <w:num w:numId="1" w16cid:durableId="920331430">
     <w:abstractNumId w:val="0"/>
   </w:num>
-  <w:num w:numId="2">
+  <w:num w:numId="2" w16cid:durableId="1703506983">
     <w:abstractNumId w:val="3"/>
   </w:num>
-  <w:num w:numId="3">
+  <w:num w:numId="3" w16cid:durableId="415442653">
     <w:abstractNumId w:val="3"/>
     <w:lvlOverride w:ilvl="0">
       <w:startOverride w:val="1"/>
     </w:lvlOverride>
   </w:num>
-  <w:num w:numId="4">
+  <w:num w:numId="4" w16cid:durableId="682123856">
     <w:abstractNumId w:val="1"/>
   </w:num>
-  <w:num w:numId="5">
+  <w:num w:numId="5" w16cid:durableId="28727595">
     <w:abstractNumId w:val="2"/>
   </w:num>
 </w:numbering>
@@ -1743,6 +1813,7 @@
     <w:lsdException w:name="HTML Sample" w:semiHidden="1" w:unhideWhenUsed="1"/>
     <w:lsdException w:name="HTML Typewriter" w:semiHidden="1" w:unhideWhenUsed="1"/>
     <w:lsdException w:name="HTML Variable" w:semiHidden="1" w:unhideWhenUsed="1"/>
+    <w:lsdException w:name="Normal Table" w:semiHidden="1" w:unhideWhenUsed="1"/>
     <w:lsdException w:name="annotation subject" w:semiHidden="1" w:unhideWhenUsed="1"/>
     <w:lsdException w:name="No List" w:semiHidden="1" w:unhideWhenUsed="1"/>
     <w:lsdException w:name="Outline List 1" w:semiHidden="1" w:unhideWhenUsed="1"/>
@@ -1785,8 +1856,11 @@
     <w:lsdException w:name="Table Contemporary" w:semiHidden="1" w:unhideWhenUsed="1"/>
     <w:lsdException w:name="Table Elegant" w:semiHidden="1" w:unhideWhenUsed="1"/>
     <w:lsdException w:name="Table Professional" w:semiHidden="1" w:unhideWhenUsed="1"/>
+    <w:lsdException w:name="Table Subtle 1" w:semiHidden="1" w:unhideWhenUsed="1"/>
     <w:lsdException w:name="Table Subtle 2" w:semiHidden="1" w:unhideWhenUsed="1"/>
     <w:lsdException w:name="Table Web 1" w:semiHidden="1" w:unhideWhenUsed="1"/>
+    <w:lsdException w:name="Table Web 2" w:semiHidden="1" w:unhideWhenUsed="1"/>
+    <w:lsdException w:name="Table Web 3" w:semiHidden="1" w:unhideWhenUsed="1"/>
     <w:lsdException w:name="Balloon Text" w:semiHidden="1" w:unhideWhenUsed="1"/>
     <w:lsdException w:name="Table Grid" w:uiPriority="39"/>
     <w:lsdException w:name="Table Theme" w:semiHidden="1" w:unhideWhenUsed="1"/>
@@ -2549,7 +2623,7 @@
 </file>
 
 <file path=word/glossary/document.xml><?xml version="1.0" encoding="utf-8"?>
-<w:glossaryDocument xmlns:wpc="http://schemas.microsoft.com/office/word/2010/wordprocessingCanvas" xmlns:cx="http://schemas.microsoft.com/office/drawing/2014/chartex" xmlns:cx1="http://schemas.microsoft.com/office/drawing/2015/9/8/chartex" xmlns:cx2="http://schemas.microsoft.com/office/drawing/2015/10/21/chartex" xmlns:cx3="http://schemas.microsoft.com/office/drawing/2016/5/9/chartex" xmlns:cx4="http://schemas.microsoft.com/office/drawing/2016/5/10/chartex" xmlns:cx5="http://schemas.microsoft.com/office/drawing/2016/5/11/chartex" xmlns:cx6="http://schemas.microsoft.com/office/drawing/2016/5/12/chartex" xmlns:cx7="http://schemas.microsoft.com/office/drawing/2016/5/13/chartex" xmlns:cx8="http://schemas.microsoft.com/office/drawing/2016/5/14/chartex" xmlns:mc="http://schemas.openxmlformats.org/markup-compatibility/2006" xmlns:aink="http://schemas.microsoft.com/office/drawing/2016/ink" xmlns:am3d="http://schemas.microsoft.com/office/drawing/2017/model3d" xmlns:o="urn:schemas-microsoft-com:office:office" xmlns:r="http://schemas.openxmlformats.org/officeDocument/2006/relationships" xmlns:m="http://schemas.openxmlformats.org/officeDocument/2006/math" xmlns:v="urn:schemas-microsoft-com:vml" xmlns:wp14="http://schemas.microsoft.com/office/word/2010/wordprocessingDrawing" xmlns:wp="http://schemas.openxmlformats.org/drawingml/2006/wordprocessingDrawing" xmlns:w10="urn:schemas-microsoft-com:office:word" xmlns:w="http://schemas.openxmlformats.org/wordprocessingml/2006/main" xmlns:w14="http://schemas.microsoft.com/office/word/2010/wordml" xmlns:w15="http://schemas.microsoft.com/office/word/2012/wordml" xmlns:w16cex="http://schemas.microsoft.com/office/word/2018/wordml/cex" xmlns:w16cid="http://schemas.microsoft.com/office/word/2016/wordml/cid" xmlns:w16="http://schemas.microsoft.com/office/word/2018/wordml" xmlns:w16sdtdh="http://schemas.microsoft.com/office/word/2020/wordml/sdtdatahash" xmlns:w16se="http://schemas.microsoft.com/office/word/2015/wordml/symex" xmlns:wpg="http://schemas.microsoft.com/office/word/2010/wordprocessingGroup" xmlns:wpi="http://schemas.microsoft.com/office/word/2010/wordprocessingInk" xmlns:wne="http://schemas.microsoft.com/office/word/2006/wordml" xmlns:wps="http://schemas.microsoft.com/office/word/2010/wordprocessingShape" mc:Ignorable="w14 w15 w16se w16cid w16 w16cex w16sdtdh wp14">
+<w:glossaryDocument xmlns:wpc="http://schemas.microsoft.com/office/word/2010/wordprocessingCanvas" xmlns:cx="http://schemas.microsoft.com/office/drawing/2014/chartex" xmlns:cx1="http://schemas.microsoft.com/office/drawing/2015/9/8/chartex" xmlns:cx2="http://schemas.microsoft.com/office/drawing/2015/10/21/chartex" xmlns:cx3="http://schemas.microsoft.com/office/drawing/2016/5/9/chartex" xmlns:cx4="http://schemas.microsoft.com/office/drawing/2016/5/10/chartex" xmlns:cx5="http://schemas.microsoft.com/office/drawing/2016/5/11/chartex" xmlns:cx6="http://schemas.microsoft.com/office/drawing/2016/5/12/chartex" xmlns:cx7="http://schemas.microsoft.com/office/drawing/2016/5/13/chartex" xmlns:cx8="http://schemas.microsoft.com/office/drawing/2016/5/14/chartex" xmlns:mc="http://schemas.openxmlformats.org/markup-compatibility/2006" xmlns:aink="http://schemas.microsoft.com/office/drawing/2016/ink" xmlns:am3d="http://schemas.microsoft.com/office/drawing/2017/model3d" xmlns:o="urn:schemas-microsoft-com:office:office" xmlns:oel="http://schemas.microsoft.com/office/2019/extlst" xmlns:r="http://schemas.openxmlformats.org/officeDocument/2006/relationships" xmlns:m="http://schemas.openxmlformats.org/officeDocument/2006/math" xmlns:v="urn:schemas-microsoft-com:vml" xmlns:wp14="http://schemas.microsoft.com/office/word/2010/wordprocessingDrawing" xmlns:wp="http://schemas.openxmlformats.org/drawingml/2006/wordprocessingDrawing" xmlns:w10="urn:schemas-microsoft-com:office:word" xmlns:w="http://schemas.openxmlformats.org/wordprocessingml/2006/main" xmlns:w14="http://schemas.microsoft.com/office/word/2010/wordml" xmlns:w15="http://schemas.microsoft.com/office/word/2012/wordml" xmlns:w16cex="http://schemas.microsoft.com/office/word/2018/wordml/cex" xmlns:w16cid="http://schemas.microsoft.com/office/word/2016/wordml/cid" xmlns:w16="http://schemas.microsoft.com/office/word/2018/wordml" xmlns:w16sdtdh="http://schemas.microsoft.com/office/word/2020/wordml/sdtdatahash" xmlns:w16se="http://schemas.microsoft.com/office/word/2015/wordml/symex" xmlns:wpg="http://schemas.microsoft.com/office/word/2010/wordprocessingGroup" xmlns:wpi="http://schemas.microsoft.com/office/word/2010/wordprocessingInk" xmlns:wne="http://schemas.microsoft.com/office/word/2006/wordml" xmlns:wps="http://schemas.microsoft.com/office/word/2010/wordprocessingShape" mc:Ignorable="w14 w15 w16se w16cid w16 w16cex w16sdtdh wp14">
   <w:docParts>
     <w:docPart>
       <w:docPartPr>
@@ -2667,6 +2741,7 @@
     <w:rsid w:val="00275326"/>
     <w:rsid w:val="00337037"/>
     <w:rsid w:val="003C1E1D"/>
+    <w:rsid w:val="004B0544"/>
     <w:rsid w:val="00673D89"/>
     <w:rsid w:val="006B4123"/>
     <w:rsid w:val="00704804"/>
@@ -2829,6 +2904,7 @@
     <w:lsdException w:name="HTML Sample" w:semiHidden="1" w:unhideWhenUsed="1"/>
     <w:lsdException w:name="HTML Typewriter" w:semiHidden="1" w:unhideWhenUsed="1"/>
     <w:lsdException w:name="HTML Variable" w:semiHidden="1" w:unhideWhenUsed="1"/>
+    <w:lsdException w:name="Normal Table" w:semiHidden="1" w:unhideWhenUsed="1"/>
     <w:lsdException w:name="annotation subject" w:semiHidden="1" w:unhideWhenUsed="1"/>
     <w:lsdException w:name="No List" w:semiHidden="1" w:unhideWhenUsed="1"/>
     <w:lsdException w:name="Outline List 1" w:semiHidden="1" w:unhideWhenUsed="1"/>
@@ -2871,8 +2947,11 @@
     <w:lsdException w:name="Table Contemporary" w:semiHidden="1" w:unhideWhenUsed="1"/>
     <w:lsdException w:name="Table Elegant" w:semiHidden="1" w:unhideWhenUsed="1"/>
     <w:lsdException w:name="Table Professional" w:semiHidden="1" w:unhideWhenUsed="1"/>
+    <w:lsdException w:name="Table Subtle 1" w:semiHidden="1" w:unhideWhenUsed="1"/>
     <w:lsdException w:name="Table Subtle 2" w:semiHidden="1" w:unhideWhenUsed="1"/>
     <w:lsdException w:name="Table Web 1" w:semiHidden="1" w:unhideWhenUsed="1"/>
+    <w:lsdException w:name="Table Web 2" w:semiHidden="1" w:unhideWhenUsed="1"/>
+    <w:lsdException w:name="Table Web 3" w:semiHidden="1" w:unhideWhenUsed="1"/>
     <w:lsdException w:name="Balloon Text" w:semiHidden="1" w:unhideWhenUsed="1"/>
     <w:lsdException w:name="Table Grid" w:uiPriority="39"/>
     <w:lsdException w:name="Table Theme" w:semiHidden="1" w:unhideWhenUsed="1"/>

</xml_diff>